<commit_message>
Corrige sello y correlativo de archivos
</commit_message>
<xml_diff>
--- a/plantillas/plantilla_archivo_leve.docx
+++ b/plantillas/plantilla_archivo_leve.docx
@@ -335,11 +335,11 @@
         <w:drawing>
           <wp:anchor distT="0" distB="0" distL="114300" distR="114300" simplePos="0" relativeHeight="251664384" behindDoc="0" locked="0" layoutInCell="1" allowOverlap="1" wp14:anchorId="5A3B08F1" wp14:editId="5A3B5A7C">
             <wp:simplePos x="0" y="0"/>
-            <wp:positionH relativeFrom="margin">
-              <wp:posOffset>2158316</wp:posOffset>
+            <wp:positionH relativeFrom="page">
+              <wp:posOffset>2550000</wp:posOffset>
             </wp:positionH>
-            <wp:positionV relativeFrom="paragraph">
-              <wp:posOffset>283245</wp:posOffset>
+            <wp:positionV relativeFrom="page">
+              <wp:posOffset>7100000</wp:posOffset>
             </wp:positionV>
             <wp:extent cx="2702560" cy="1323975"/>
             <wp:effectExtent l="0" t="0" r="2540" b="9525"/>

</xml_diff>